<commit_message>
docs: add Zenodo DOI (10.5281/zenodo.22087936) to Data availability in paper_en_ICUtransfer_v13.docx
</commit_message>
<xml_diff>
--- a/manuscript/paper_en_ICUtransfer_v13.docx
+++ b/manuscript/paper_en_ICUtransfer_v13.docx
@@ -5703,14 +5703,7 @@
         </w:rPr>
       </w:pPr>
       <w:r>
-        <w:rPr>
-          <w:rFonts w:ascii="Times New Roman" w:hAnsi="Times New Roman" w:eastAsia="宋体"/>
-          <w:b w:val="0"/>
-          <w:i w:val="0"/>
-          <w:sz w:val="20"/>
-          <w:szCs w:val="20"/>
-        </w:rPr>
-        <w:t>MIMIC-IV, INSPIRE, and eICU are publicly available after registration and data use agreement with PhysioNet. The local dataset used in this study is not publicly available because of institutional privacy regulations but is available from the corresponding authors on reasonable request.</w:t>
+        <w:t>MIMIC-IV, INSPIRE, and eICU are publicly available after registration and data use agreement with PhysioNet. The local dataset used in this study is not publicly available because of institutional privacy regulations but is available from the corresponding authors on reasonable request. The de-identified derived cohort, analysis code, and a bilingual (English/Chinese) web calculator are archived and publicly available at Zenodo (https://doi.org/10.5281/zenodo.22087936); the live calculator is at https://morrosun.github.io/ortho-gnri-nlr-icu-transfer/.</w:t>
       </w:r>
     </w:p>
     <w:p>

</xml_diff>

<commit_message>
docs: replace Figure 1 with clean, non-overlapping version in paper_en_ICUtransfer_v13.docx
</commit_message>
<xml_diff>
--- a/manuscript/paper_en_ICUtransfer_v13.docx
+++ b/manuscript/paper_en_ICUtransfer_v13.docx
@@ -877,7 +877,7 @@
         </w:rPr>
         <w:drawing>
           <wp:inline distT="0" distB="0" distL="114300" distR="114300">
-            <wp:extent cx="5171440" cy="3389630"/>
+            <wp:extent cx="5171440" cy="3567893"/>
             <wp:effectExtent l="0" t="0" r="10160" b="1270"/>
             <wp:docPr id="1" name="Picture 1"/>
             <wp:cNvGraphicFramePr>
@@ -901,7 +901,7 @@
                   <pic:spPr>
                     <a:xfrm>
                       <a:off x="0" y="0"/>
-                      <a:ext cx="5171707" cy="3390206"/>
+                      <a:ext cx="5171707" cy="3568077"/>
                     </a:xfrm>
                     <a:prstGeom prst="rect">
                       <a:avLst/>

</xml_diff>